<commit_message>
Update on Day 8 Homework (Done)
Tasks from 15 to 20
</commit_message>
<xml_diff>
--- a/Codes and Projects/Servicenow development/Day 8 Homework/Day 8 Homework.docx
+++ b/Codes and Projects/Servicenow development/Day 8 Homework/Day 8 Homework.docx
@@ -75,16 +75,10 @@
         <w:pStyle w:val="Heading2"/>
       </w:pPr>
       <w:r>
-        <w:t xml:space="preserve">Task </w:t>
-      </w:r>
-      <w:r>
-        <w:t>2</w:t>
-      </w:r>
-      <w:r>
-        <w:t xml:space="preserve"> </w:t>
-      </w:r>
-      <w:r>
-        <w:t>(Easy)</w:t>
+        <w:t>Task 2</w:t>
+      </w:r>
+      <w:r>
+        <w:t xml:space="preserve"> (Easy)</w:t>
       </w:r>
     </w:p>
     <w:p>
@@ -98,6 +92,9 @@
         <w:br/>
       </w:r>
       <w:r>
+        <w:rPr>
+          <w:noProof/>
+        </w:rPr>
         <w:drawing>
           <wp:inline distT="0" distB="0" distL="0" distR="0" wp14:anchorId="1B43DED8" wp14:editId="718E07B5">
             <wp:extent cx="6788269" cy="3067050"/>
@@ -142,16 +139,10 @@
       </w:pPr>
       <w:r>
         <w:lastRenderedPageBreak/>
-        <w:t xml:space="preserve">Task </w:t>
-      </w:r>
-      <w:r>
-        <w:t>3</w:t>
-      </w:r>
-      <w:r>
-        <w:t xml:space="preserve"> </w:t>
-      </w:r>
-      <w:r>
-        <w:t>(Easy)</w:t>
+        <w:t>Task 3</w:t>
+      </w:r>
+      <w:r>
+        <w:t xml:space="preserve"> (Easy)</w:t>
       </w:r>
     </w:p>
     <w:p>
@@ -162,6 +153,9 @@
         <w:br/>
       </w:r>
       <w:r>
+        <w:rPr>
+          <w:noProof/>
+        </w:rPr>
         <w:drawing>
           <wp:inline distT="0" distB="0" distL="0" distR="0" wp14:anchorId="5714F934" wp14:editId="0B5D5C58">
             <wp:extent cx="6945563" cy="3429000"/>
@@ -204,16 +198,10 @@
         <w:pStyle w:val="Heading2"/>
       </w:pPr>
       <w:r>
-        <w:t xml:space="preserve">Task </w:t>
-      </w:r>
-      <w:r>
-        <w:t>4</w:t>
-      </w:r>
-      <w:r>
-        <w:t xml:space="preserve"> </w:t>
-      </w:r>
-      <w:r>
-        <w:t>(Easy)</w:t>
+        <w:t>Task 4</w:t>
+      </w:r>
+      <w:r>
+        <w:t xml:space="preserve"> (Easy)</w:t>
       </w:r>
     </w:p>
     <w:p>
@@ -221,6 +209,9 @@
         <w:t>When Category is cleared, clear the Subcategory field automatically</w:t>
       </w:r>
       <w:r>
+        <w:rPr>
+          <w:noProof/>
+        </w:rPr>
         <w:drawing>
           <wp:inline distT="0" distB="0" distL="0" distR="0" wp14:anchorId="002EBF0D" wp14:editId="081BFFA9">
             <wp:extent cx="7000833" cy="2501900"/>
@@ -265,16 +256,10 @@
       </w:pPr>
       <w:r>
         <w:lastRenderedPageBreak/>
-        <w:t xml:space="preserve">Task </w:t>
-      </w:r>
-      <w:r>
-        <w:t>5</w:t>
-      </w:r>
-      <w:r>
-        <w:t xml:space="preserve"> </w:t>
-      </w:r>
-      <w:r>
-        <w:t>(Easy)</w:t>
+        <w:t>Task 5</w:t>
+      </w:r>
+      <w:r>
+        <w:t xml:space="preserve"> (Easy)</w:t>
       </w:r>
     </w:p>
     <w:p>
@@ -285,6 +270,9 @@
         <w:br/>
       </w:r>
       <w:r>
+        <w:rPr>
+          <w:noProof/>
+        </w:rPr>
         <w:drawing>
           <wp:inline distT="0" distB="0" distL="0" distR="0" wp14:anchorId="33635D6C" wp14:editId="5D943819">
             <wp:extent cx="6900188" cy="3435350"/>
@@ -327,16 +315,10 @@
         <w:pStyle w:val="Heading2"/>
       </w:pPr>
       <w:r>
-        <w:t xml:space="preserve">Task </w:t>
-      </w:r>
-      <w:r>
-        <w:t>6</w:t>
-      </w:r>
-      <w:r>
-        <w:t xml:space="preserve"> </w:t>
-      </w:r>
-      <w:r>
-        <w:t>(Medium)</w:t>
+        <w:t>Task 6</w:t>
+      </w:r>
+      <w:r>
+        <w:t xml:space="preserve"> (Medium)</w:t>
       </w:r>
     </w:p>
     <w:p>
@@ -347,6 +329,9 @@
         <w:br/>
       </w:r>
       <w:r>
+        <w:rPr>
+          <w:noProof/>
+        </w:rPr>
         <w:drawing>
           <wp:inline distT="0" distB="0" distL="0" distR="0" wp14:anchorId="3DBA8A88" wp14:editId="4D1F2D36">
             <wp:extent cx="7088863" cy="3099105"/>
@@ -390,26 +375,31 @@
       </w:pPr>
       <w:r>
         <w:lastRenderedPageBreak/>
-        <w:t xml:space="preserve">Task </w:t>
-      </w:r>
-      <w:r>
-        <w:t>7</w:t>
+        <w:t>Task 7</w:t>
+      </w:r>
+      <w:r>
+        <w:t xml:space="preserve"> (Medium)</w:t>
+      </w:r>
+    </w:p>
+    <w:p>
+      <w:r>
+        <w:t xml:space="preserve">If the Caller is VIP, automatically </w:t>
+      </w:r>
+      <w:proofErr w:type="gramStart"/>
+      <w:r>
+        <w:t>set:</w:t>
+      </w:r>
+      <w:proofErr w:type="gramEnd"/>
+      <w:r>
+        <w:t xml:space="preserve"> Priority = High, Urgency = High</w:t>
       </w:r>
       <w:r>
         <w:t xml:space="preserve"> </w:t>
       </w:r>
       <w:r>
-        <w:t>(Medium)</w:t>
-      </w:r>
-    </w:p>
-    <w:p>
-      <w:r>
-        <w:t>If the Caller is VIP, automatically set: Priority = High, Urgency = High</w:t>
-      </w:r>
-      <w:r>
-        <w:t xml:space="preserve"> </w:t>
-      </w:r>
-      <w:r>
+        <w:rPr>
+          <w:noProof/>
+        </w:rPr>
         <w:drawing>
           <wp:inline distT="0" distB="0" distL="0" distR="0" wp14:anchorId="27CD8583" wp14:editId="572B1EA9">
             <wp:extent cx="6352505" cy="3377821"/>
@@ -452,29 +442,23 @@
         <w:pStyle w:val="Heading2"/>
       </w:pPr>
       <w:r>
-        <w:t xml:space="preserve">Task </w:t>
-      </w:r>
-      <w:r>
-        <w:t>8</w:t>
-      </w:r>
-      <w:r>
-        <w:t xml:space="preserve"> </w:t>
-      </w:r>
-      <w:r>
-        <w:t>(Medium)</w:t>
-      </w:r>
-    </w:p>
-    <w:p>
-      <w:r>
-        <w:t>When Category = Software, show Assignment Group field, otherwise hide it.</w:t>
-      </w:r>
-      <w:r>
-        <w:t xml:space="preserve"> </w:t>
+        <w:t>Task 8</w:t>
+      </w:r>
+      <w:r>
+        <w:t xml:space="preserve"> (Medium)</w:t>
+      </w:r>
+    </w:p>
+    <w:p>
+      <w:r>
+        <w:t xml:space="preserve">When Category = Software, show Assignment Group field, otherwise hide it. </w:t>
       </w:r>
       <w:r>
         <w:br/>
       </w:r>
       <w:r>
+        <w:rPr>
+          <w:noProof/>
+        </w:rPr>
         <w:drawing>
           <wp:inline distT="0" distB="0" distL="0" distR="0" wp14:anchorId="67E555F7" wp14:editId="17F93B87">
             <wp:extent cx="6564573" cy="3201445"/>
@@ -518,13 +502,7 @@
       </w:pPr>
       <w:r>
         <w:lastRenderedPageBreak/>
-        <w:t xml:space="preserve">Task </w:t>
-      </w:r>
-      <w:r>
-        <w:t xml:space="preserve">9 </w:t>
-      </w:r>
-      <w:r>
-        <w:t>(Medium)</w:t>
+        <w:t>Task 9 (Medium)</w:t>
       </w:r>
     </w:p>
     <w:p>
@@ -535,6 +513,9 @@
         <w:br/>
       </w:r>
       <w:r>
+        <w:rPr>
+          <w:noProof/>
+        </w:rPr>
         <w:drawing>
           <wp:inline distT="0" distB="0" distL="0" distR="0" wp14:anchorId="66C57F6C" wp14:editId="79394643">
             <wp:extent cx="6977711" cy="2866030"/>
@@ -577,13 +558,7 @@
         <w:pStyle w:val="Heading2"/>
       </w:pPr>
       <w:r>
-        <w:t xml:space="preserve">Task </w:t>
-      </w:r>
-      <w:r>
-        <w:t>10</w:t>
-      </w:r>
-      <w:r>
-        <w:t xml:space="preserve"> (Medium)</w:t>
+        <w:t>Task 10 (Medium)</w:t>
       </w:r>
     </w:p>
     <w:p>
@@ -594,6 +569,9 @@
         <w:br/>
       </w:r>
       <w:r>
+        <w:rPr>
+          <w:noProof/>
+        </w:rPr>
         <w:drawing>
           <wp:inline distT="0" distB="0" distL="0" distR="0" wp14:anchorId="615C5251" wp14:editId="5B7D1D67">
             <wp:extent cx="7066698" cy="2927445"/>
@@ -639,13 +617,7 @@
       </w:pPr>
       <w:r>
         <w:lastRenderedPageBreak/>
-        <w:t>Task 1</w:t>
-      </w:r>
-      <w:r>
-        <w:t>1</w:t>
-      </w:r>
-      <w:r>
-        <w:t xml:space="preserve"> (</w:t>
+        <w:t>Task 11 (</w:t>
       </w:r>
       <w:r>
         <w:t>Important</w:t>
@@ -682,6 +654,9 @@
         <w:br/>
       </w:r>
       <w:r>
+        <w:rPr>
+          <w:noProof/>
+        </w:rPr>
         <w:drawing>
           <wp:inline distT="0" distB="0" distL="0" distR="0" wp14:anchorId="416645DC" wp14:editId="6F1BF981">
             <wp:extent cx="6610979" cy="2954740"/>
@@ -724,13 +699,7 @@
         <w:pStyle w:val="Heading2"/>
       </w:pPr>
       <w:r>
-        <w:t>Task 1</w:t>
-      </w:r>
-      <w:r>
-        <w:t>2</w:t>
-      </w:r>
-      <w:r>
-        <w:t xml:space="preserve"> (</w:t>
+        <w:t>Task 12 (</w:t>
       </w:r>
       <w:r>
         <w:t>Important</w:t>
@@ -747,10 +716,7 @@
         </w:rPr>
       </w:pPr>
       <w:r>
-        <w:t xml:space="preserve"> </w:t>
-      </w:r>
-      <w:r>
-        <w:t>If the Caller belongs to HR department, make Priority read-only.</w:t>
+        <w:t xml:space="preserve"> If the Caller belongs to HR department, make Priority read-only.</w:t>
       </w:r>
       <w:r>
         <w:br/>
@@ -759,6 +725,7 @@
         <w:rPr>
           <w:b/>
           <w:bCs/>
+          <w:noProof/>
         </w:rPr>
         <w:drawing>
           <wp:inline distT="0" distB="0" distL="0" distR="0" wp14:anchorId="033DDEA5" wp14:editId="23A0464D">
@@ -803,13 +770,7 @@
       </w:pPr>
       <w:r>
         <w:lastRenderedPageBreak/>
-        <w:t>Task 1</w:t>
-      </w:r>
-      <w:r>
-        <w:t xml:space="preserve">3 </w:t>
-      </w:r>
-      <w:r>
-        <w:t>(</w:t>
+        <w:t>Task 13 (</w:t>
       </w:r>
       <w:r>
         <w:t>Important</w:t>
@@ -831,10 +792,10 @@
       </w:r>
       <w:r>
         <w:drawing>
-          <wp:inline distT="0" distB="0" distL="0" distR="0" wp14:anchorId="2E497AD8" wp14:editId="062D9F1A">
-            <wp:extent cx="7020578" cy="2830983"/>
-            <wp:effectExtent l="0" t="0" r="8890" b="7620"/>
-            <wp:docPr id="1754508569" name="Picture 1"/>
+          <wp:inline distT="0" distB="0" distL="0" distR="0" wp14:anchorId="31EBA03C" wp14:editId="49CF0331">
+            <wp:extent cx="6860923" cy="2668137"/>
+            <wp:effectExtent l="0" t="0" r="0" b="0"/>
+            <wp:docPr id="899993458" name="Picture 1"/>
             <wp:cNvGraphicFramePr>
               <a:graphicFrameLocks xmlns:a="http://schemas.openxmlformats.org/drawingml/2006/main" noChangeAspect="1"/>
             </wp:cNvGraphicFramePr>
@@ -842,7 +803,7 @@
               <a:graphicData uri="http://schemas.openxmlformats.org/drawingml/2006/picture">
                 <pic:pic xmlns:pic="http://schemas.openxmlformats.org/drawingml/2006/picture">
                   <pic:nvPicPr>
-                    <pic:cNvPr id="1754508569" name=""/>
+                    <pic:cNvPr id="899993458" name=""/>
                     <pic:cNvPicPr/>
                   </pic:nvPicPr>
                   <pic:blipFill>
@@ -854,7 +815,7 @@
                   <pic:spPr>
                     <a:xfrm>
                       <a:off x="0" y="0"/>
-                      <a:ext cx="7024288" cy="2832479"/>
+                      <a:ext cx="6874675" cy="2673485"/>
                     </a:xfrm>
                     <a:prstGeom prst="rect">
                       <a:avLst/>
@@ -872,13 +833,7 @@
         <w:pStyle w:val="Heading2"/>
       </w:pPr>
       <w:r>
-        <w:t>Task 1</w:t>
-      </w:r>
-      <w:r>
-        <w:t>4</w:t>
-      </w:r>
-      <w:r>
-        <w:t xml:space="preserve"> (</w:t>
+        <w:t>Task 14 (</w:t>
       </w:r>
       <w:r>
         <w:t>Important</w:t>
@@ -895,6 +850,9 @@
         <w:br/>
       </w:r>
       <w:r>
+        <w:rPr>
+          <w:noProof/>
+        </w:rPr>
         <w:drawing>
           <wp:inline distT="0" distB="0" distL="0" distR="0" wp14:anchorId="4B7F003E" wp14:editId="52F2BFA9">
             <wp:extent cx="7076104" cy="2794406"/>
@@ -943,13 +901,7 @@
       </w:pPr>
       <w:r>
         <w:lastRenderedPageBreak/>
-        <w:t xml:space="preserve">Task </w:t>
-      </w:r>
-      <w:r>
-        <w:t>15</w:t>
-      </w:r>
-      <w:r>
-        <w:t xml:space="preserve"> (</w:t>
+        <w:t>Task 15 (</w:t>
       </w:r>
       <w:r>
         <w:t>Important</w:t>
@@ -1003,6 +955,7 @@
         <w:rPr>
           <w:i/>
           <w:iCs/>
+          <w:noProof/>
         </w:rPr>
         <w:drawing>
           <wp:inline distT="0" distB="0" distL="0" distR="0" wp14:anchorId="41DDEB11" wp14:editId="6EE5404E">
@@ -1046,13 +999,7 @@
         <w:pStyle w:val="Heading2"/>
       </w:pPr>
       <w:r>
-        <w:t>Task 1</w:t>
-      </w:r>
-      <w:r>
-        <w:t>6</w:t>
-      </w:r>
-      <w:r>
-        <w:t xml:space="preserve"> (</w:t>
+        <w:t>Task 16 (</w:t>
       </w:r>
       <w:r>
         <w:t>Advanced</w:t>
@@ -1068,19 +1015,55 @@
       <w:r>
         <w:t>n</w:t>
       </w:r>
-    </w:p>
+      <w:r>
+        <w:br/>
+      </w:r>
+      <w:r>
+        <w:drawing>
+          <wp:inline distT="0" distB="0" distL="0" distR="0" wp14:anchorId="02D7870A" wp14:editId="2720D39F">
+            <wp:extent cx="6837035" cy="2627194"/>
+            <wp:effectExtent l="0" t="0" r="2540" b="1905"/>
+            <wp:docPr id="1398212907" name="Picture 1"/>
+            <wp:cNvGraphicFramePr>
+              <a:graphicFrameLocks xmlns:a="http://schemas.openxmlformats.org/drawingml/2006/main" noChangeAspect="1"/>
+            </wp:cNvGraphicFramePr>
+            <a:graphic xmlns:a="http://schemas.openxmlformats.org/drawingml/2006/main">
+              <a:graphicData uri="http://schemas.openxmlformats.org/drawingml/2006/picture">
+                <pic:pic xmlns:pic="http://schemas.openxmlformats.org/drawingml/2006/picture">
+                  <pic:nvPicPr>
+                    <pic:cNvPr id="1398212907" name=""/>
+                    <pic:cNvPicPr/>
+                  </pic:nvPicPr>
+                  <pic:blipFill>
+                    <a:blip r:embed="rId22"/>
+                    <a:stretch>
+                      <a:fillRect/>
+                    </a:stretch>
+                  </pic:blipFill>
+                  <pic:spPr>
+                    <a:xfrm>
+                      <a:off x="0" y="0"/>
+                      <a:ext cx="6851032" cy="2632573"/>
+                    </a:xfrm>
+                    <a:prstGeom prst="rect">
+                      <a:avLst/>
+                    </a:prstGeom>
+                  </pic:spPr>
+                </pic:pic>
+              </a:graphicData>
+            </a:graphic>
+          </wp:inline>
+        </w:drawing>
+      </w:r>
+    </w:p>
+    <w:p/>
     <w:p>
       <w:pPr>
         <w:pStyle w:val="Heading2"/>
       </w:pPr>
       <w:r>
-        <w:t>Task 1</w:t>
-      </w:r>
-      <w:r>
-        <w:t>7</w:t>
-      </w:r>
-      <w:r>
-        <w:t xml:space="preserve"> (</w:t>
+        <w:lastRenderedPageBreak/>
+        <w:t>Task 17 (</w:t>
       </w:r>
       <w:r>
         <w:t>Advanced</w:t>
@@ -1099,36 +1082,49 @@
       <w:r>
         <w:t>If Impact = High and Urgency = High, show a warning message: “Critical Incident”.</w:t>
       </w:r>
-    </w:p>
-    <w:p>
-      <w:pPr>
-        <w:pStyle w:val="Heading2"/>
-      </w:pPr>
-      <w:r>
-        <w:t>Task 1</w:t>
-      </w:r>
-      <w:r>
-        <w:t>8</w:t>
-      </w:r>
-      <w:r>
-        <w:t xml:space="preserve"> (</w:t>
-      </w:r>
-      <w:r>
-        <w:t>Advanced</w:t>
-      </w:r>
-      <w:r>
-        <w:t>)</w:t>
-      </w:r>
-    </w:p>
-    <w:p>
-      <w:pPr>
+      <w:r>
+        <w:br/>
+      </w:r>
+      <w:r>
         <w:rPr>
           <w:i/>
           <w:iCs/>
         </w:rPr>
-      </w:pPr>
-      <w:r>
-        <w:t>When Assignment Group is selected, make Assigned To mandatory</w:t>
+        <w:drawing>
+          <wp:inline distT="0" distB="0" distL="0" distR="0" wp14:anchorId="266B44E6" wp14:editId="1DF28082">
+            <wp:extent cx="6858000" cy="2803525"/>
+            <wp:effectExtent l="0" t="0" r="0" b="0"/>
+            <wp:docPr id="949083316" name="Picture 1"/>
+            <wp:cNvGraphicFramePr>
+              <a:graphicFrameLocks xmlns:a="http://schemas.openxmlformats.org/drawingml/2006/main" noChangeAspect="1"/>
+            </wp:cNvGraphicFramePr>
+            <a:graphic xmlns:a="http://schemas.openxmlformats.org/drawingml/2006/main">
+              <a:graphicData uri="http://schemas.openxmlformats.org/drawingml/2006/picture">
+                <pic:pic xmlns:pic="http://schemas.openxmlformats.org/drawingml/2006/picture">
+                  <pic:nvPicPr>
+                    <pic:cNvPr id="949083316" name=""/>
+                    <pic:cNvPicPr/>
+                  </pic:nvPicPr>
+                  <pic:blipFill>
+                    <a:blip r:embed="rId23"/>
+                    <a:stretch>
+                      <a:fillRect/>
+                    </a:stretch>
+                  </pic:blipFill>
+                  <pic:spPr>
+                    <a:xfrm>
+                      <a:off x="0" y="0"/>
+                      <a:ext cx="6858000" cy="2803525"/>
+                    </a:xfrm>
+                    <a:prstGeom prst="rect">
+                      <a:avLst/>
+                    </a:prstGeom>
+                  </pic:spPr>
+                </pic:pic>
+              </a:graphicData>
+            </a:graphic>
+          </wp:inline>
+        </w:drawing>
       </w:r>
     </w:p>
     <w:p>
@@ -1136,13 +1132,7 @@
         <w:pStyle w:val="Heading2"/>
       </w:pPr>
       <w:r>
-        <w:t>Task 1</w:t>
-      </w:r>
-      <w:r>
-        <w:t>9</w:t>
-      </w:r>
-      <w:r>
-        <w:t xml:space="preserve"> (</w:t>
+        <w:t>Task 18 (</w:t>
       </w:r>
       <w:r>
         <w:t>Advanced</w:t>
@@ -1159,6 +1149,76 @@
         </w:rPr>
       </w:pPr>
       <w:r>
+        <w:t>When Assignment Group is selected, make Assigned To mandatory</w:t>
+      </w:r>
+      <w:r>
+        <w:br/>
+      </w:r>
+      <w:r>
+        <w:rPr>
+          <w:i/>
+          <w:iCs/>
+        </w:rPr>
+        <w:drawing>
+          <wp:inline distT="0" distB="0" distL="0" distR="0" wp14:anchorId="456161E8" wp14:editId="3BFF0CFB">
+            <wp:extent cx="6858000" cy="3709035"/>
+            <wp:effectExtent l="0" t="0" r="0" b="5715"/>
+            <wp:docPr id="1848931185" name="Picture 1"/>
+            <wp:cNvGraphicFramePr>
+              <a:graphicFrameLocks xmlns:a="http://schemas.openxmlformats.org/drawingml/2006/main" noChangeAspect="1"/>
+            </wp:cNvGraphicFramePr>
+            <a:graphic xmlns:a="http://schemas.openxmlformats.org/drawingml/2006/main">
+              <a:graphicData uri="http://schemas.openxmlformats.org/drawingml/2006/picture">
+                <pic:pic xmlns:pic="http://schemas.openxmlformats.org/drawingml/2006/picture">
+                  <pic:nvPicPr>
+                    <pic:cNvPr id="1848931185" name=""/>
+                    <pic:cNvPicPr/>
+                  </pic:nvPicPr>
+                  <pic:blipFill>
+                    <a:blip r:embed="rId24"/>
+                    <a:stretch>
+                      <a:fillRect/>
+                    </a:stretch>
+                  </pic:blipFill>
+                  <pic:spPr>
+                    <a:xfrm>
+                      <a:off x="0" y="0"/>
+                      <a:ext cx="6858000" cy="3709035"/>
+                    </a:xfrm>
+                    <a:prstGeom prst="rect">
+                      <a:avLst/>
+                    </a:prstGeom>
+                  </pic:spPr>
+                </pic:pic>
+              </a:graphicData>
+            </a:graphic>
+          </wp:inline>
+        </w:drawing>
+      </w:r>
+    </w:p>
+    <w:p>
+      <w:pPr>
+        <w:pStyle w:val="Heading2"/>
+      </w:pPr>
+      <w:r>
+        <w:lastRenderedPageBreak/>
+        <w:t>Task 19 (</w:t>
+      </w:r>
+      <w:r>
+        <w:t>Advanced</w:t>
+      </w:r>
+      <w:r>
+        <w:t>)</w:t>
+      </w:r>
+    </w:p>
+    <w:p>
+      <w:pPr>
+        <w:rPr>
+          <w:i/>
+          <w:iCs/>
+        </w:rPr>
+      </w:pPr>
+      <w:r>
         <w:t>If Caller location is India, set State = New automatically</w:t>
       </w:r>
     </w:p>
@@ -1168,14 +1228,7 @@
         <w:pStyle w:val="Heading2"/>
       </w:pPr>
       <w:r>
-        <w:lastRenderedPageBreak/>
-        <w:t xml:space="preserve">Task </w:t>
-      </w:r>
-      <w:r>
-        <w:t>20</w:t>
-      </w:r>
-      <w:r>
-        <w:t xml:space="preserve"> (</w:t>
+        <w:t>Task 20 (</w:t>
       </w:r>
       <w:r>
         <w:t>Advanced</w:t>
@@ -1189,8 +1242,47 @@
         <w:t>When user tries to submit without selecting Category, block submission with alert</w:t>
       </w:r>
     </w:p>
+    <w:p>
+      <w:r>
+        <w:drawing>
+          <wp:inline distT="0" distB="0" distL="0" distR="0" wp14:anchorId="2A97EA47" wp14:editId="0F8B7E9C">
+            <wp:extent cx="6858000" cy="2448560"/>
+            <wp:effectExtent l="0" t="0" r="0" b="8890"/>
+            <wp:docPr id="1547016117" name="Picture 1"/>
+            <wp:cNvGraphicFramePr>
+              <a:graphicFrameLocks xmlns:a="http://schemas.openxmlformats.org/drawingml/2006/main" noChangeAspect="1"/>
+            </wp:cNvGraphicFramePr>
+            <a:graphic xmlns:a="http://schemas.openxmlformats.org/drawingml/2006/main">
+              <a:graphicData uri="http://schemas.openxmlformats.org/drawingml/2006/picture">
+                <pic:pic xmlns:pic="http://schemas.openxmlformats.org/drawingml/2006/picture">
+                  <pic:nvPicPr>
+                    <pic:cNvPr id="1547016117" name=""/>
+                    <pic:cNvPicPr/>
+                  </pic:nvPicPr>
+                  <pic:blipFill>
+                    <a:blip r:embed="rId25"/>
+                    <a:stretch>
+                      <a:fillRect/>
+                    </a:stretch>
+                  </pic:blipFill>
+                  <pic:spPr>
+                    <a:xfrm>
+                      <a:off x="0" y="0"/>
+                      <a:ext cx="6858000" cy="2448560"/>
+                    </a:xfrm>
+                    <a:prstGeom prst="rect">
+                      <a:avLst/>
+                    </a:prstGeom>
+                  </pic:spPr>
+                </pic:pic>
+              </a:graphicData>
+            </a:graphic>
+          </wp:inline>
+        </w:drawing>
+      </w:r>
+    </w:p>
     <w:sectPr>
-      <w:footerReference w:type="default" r:id="rId22"/>
+      <w:footerReference w:type="default" r:id="rId26"/>
       <w:pgSz w:w="12240" w:h="15840"/>
       <w:pgMar w:top="720" w:right="720" w:bottom="720" w:left="720" w:header="720" w:footer="792" w:gutter="0"/>
       <w:cols w:space="720"/>

</xml_diff>